<commit_message>
App: farm boundary (draw or zipped shapefile), Home button, new look, live server default
Draw the farm outline on the map or import a zipped shapefile (geographic and UTM, validated against PROJ in tests); the boundary centre drives Farm Insights. Home button on every screen. Animated landing page, new palette and icon, default server set to the live API. Dashboard shows boundaries mapped. Design documents updated. IDE settings removed from the repository.

Co-Authored-By: Claude Sonnet 5.5 <noreply@anthropic.com>
</commit_message>
<xml_diff>
--- a/MarketMoo_1_Product_Design_Document.docx
+++ b/MarketMoo_1_Product_Design_Document.docx
@@ -6103,7 +6103,261 @@
                 <w:sz w:val="19"/>
                 <w:szCs w:val="19"/>
               </w:rPr>
-              <w:t xml:space="preserve">Register and sign in with phone number and SMS one-time code; farm profile (livestock, ward, farm pin).</w:t>
+              <w:t xml:space="preserve">Register and sign in with phone number and SMS one-time code; farm profile (livestock, ward).</w:t>
+            </w:r>
+          </w:p>
+        </w:tc>
+        <w:tc>
+          <w:tcPr>
+            <w:tcW w:type="dxa" w:w="576"/>
+            <w:tcBorders>
+              <w:top w:val="single" w:color="BFBFBF" w:sz="4"/>
+              <w:left w:val="single" w:color="BFBFBF" w:sz="4"/>
+              <w:bottom w:val="single" w:color="BFBFBF" w:sz="4"/>
+              <w:right w:val="single" w:color="BFBFBF" w:sz="4"/>
+            </w:tcBorders>
+            <w:shd w:fill="FAF7F0" w:color="auto" w:val="clear"/>
+            <w:tcMar>
+              <w:top w:type="dxa" w:w="60"/>
+              <w:left w:type="dxa" w:w="100"/>
+              <w:bottom w:type="dxa" w:w="60"/>
+              <w:right w:type="dxa" w:w="100"/>
+            </w:tcMar>
+          </w:tcPr>
+          <w:p>
+            <w:pPr>
+              <w:spacing w:after="20"/>
+            </w:pPr>
+            <w:r>
+              <w:rPr>
+                <w:rFonts w:ascii="Calibri" w:cs="Calibri" w:eastAsia="Calibri" w:hAnsi="Calibri"/>
+                <w:sz w:val="19"/>
+                <w:szCs w:val="19"/>
+              </w:rPr>
+              <w:t xml:space="preserve">M</w:t>
+            </w:r>
+          </w:p>
+        </w:tc>
+      </w:tr>
+      <w:tr>
+        <w:trPr>
+          <w:cantSplit/>
+        </w:trPr>
+        <w:tc>
+          <w:tcPr>
+            <w:tcW w:type="dxa" w:w="1100"/>
+            <w:tcBorders>
+              <w:top w:val="single" w:color="BFBFBF" w:sz="4"/>
+              <w:left w:val="single" w:color="BFBFBF" w:sz="4"/>
+              <w:bottom w:val="single" w:color="BFBFBF" w:sz="4"/>
+              <w:right w:val="single" w:color="BFBFBF" w:sz="4"/>
+            </w:tcBorders>
+            <w:tcMar>
+              <w:top w:type="dxa" w:w="60"/>
+              <w:left w:type="dxa" w:w="100"/>
+              <w:bottom w:type="dxa" w:w="60"/>
+              <w:right w:type="dxa" w:w="100"/>
+            </w:tcMar>
+          </w:tcPr>
+          <w:p>
+            <w:pPr>
+              <w:spacing w:after="20"/>
+            </w:pPr>
+            <w:r>
+              <w:rPr>
+                <w:rFonts w:ascii="Calibri" w:cs="Calibri" w:eastAsia="Calibri" w:hAnsi="Calibri"/>
+                <w:sz w:val="19"/>
+                <w:szCs w:val="19"/>
+              </w:rPr>
+              <w:t xml:space="preserve">FR-ON-03</w:t>
+            </w:r>
+          </w:p>
+        </w:tc>
+        <w:tc>
+          <w:tcPr>
+            <w:tcW w:type="dxa" w:w="1250"/>
+            <w:tcBorders>
+              <w:top w:val="single" w:color="BFBFBF" w:sz="4"/>
+              <w:left w:val="single" w:color="BFBFBF" w:sz="4"/>
+              <w:bottom w:val="single" w:color="BFBFBF" w:sz="4"/>
+              <w:right w:val="single" w:color="BFBFBF" w:sz="4"/>
+            </w:tcBorders>
+            <w:tcMar>
+              <w:top w:type="dxa" w:w="60"/>
+              <w:left w:type="dxa" w:w="100"/>
+              <w:bottom w:type="dxa" w:w="60"/>
+              <w:right w:type="dxa" w:w="100"/>
+            </w:tcMar>
+          </w:tcPr>
+          <w:p>
+            <w:pPr>
+              <w:spacing w:after="20"/>
+            </w:pPr>
+            <w:r>
+              <w:rPr>
+                <w:rFonts w:ascii="Calibri" w:cs="Calibri" w:eastAsia="Calibri" w:hAnsi="Calibri"/>
+                <w:sz w:val="19"/>
+                <w:szCs w:val="19"/>
+              </w:rPr>
+              <w:t xml:space="preserve">Onboarding</w:t>
+            </w:r>
+          </w:p>
+        </w:tc>
+        <w:tc>
+          <w:tcPr>
+            <w:tcW w:type="dxa" w:w="6100"/>
+            <w:tcBorders>
+              <w:top w:val="single" w:color="BFBFBF" w:sz="4"/>
+              <w:left w:val="single" w:color="BFBFBF" w:sz="4"/>
+              <w:bottom w:val="single" w:color="BFBFBF" w:sz="4"/>
+              <w:right w:val="single" w:color="BFBFBF" w:sz="4"/>
+            </w:tcBorders>
+            <w:tcMar>
+              <w:top w:type="dxa" w:w="60"/>
+              <w:left w:type="dxa" w:w="100"/>
+              <w:bottom w:type="dxa" w:w="60"/>
+              <w:right w:type="dxa" w:w="100"/>
+            </w:tcMar>
+          </w:tcPr>
+          <w:p>
+            <w:pPr>
+              <w:spacing w:after="20"/>
+            </w:pPr>
+            <w:r>
+              <w:rPr>
+                <w:rFonts w:ascii="Calibri" w:cs="Calibri" w:eastAsia="Calibri" w:hAnsi="Calibri"/>
+                <w:sz w:val="19"/>
+                <w:szCs w:val="19"/>
+              </w:rPr>
+              <w:t xml:space="preserve">Mark the farm boundary instead of a single pin: draw it on the map (tap corners or add GPS positions as corners) or upload a zipped shapefile. Area is shown in hectares; the boundary centre drives every insight. A quick pin remains as a fallback. The outline stays private.</w:t>
+            </w:r>
+          </w:p>
+        </w:tc>
+        <w:tc>
+          <w:tcPr>
+            <w:tcW w:type="dxa" w:w="576"/>
+            <w:tcBorders>
+              <w:top w:val="single" w:color="BFBFBF" w:sz="4"/>
+              <w:left w:val="single" w:color="BFBFBF" w:sz="4"/>
+              <w:bottom w:val="single" w:color="BFBFBF" w:sz="4"/>
+              <w:right w:val="single" w:color="BFBFBF" w:sz="4"/>
+            </w:tcBorders>
+            <w:tcMar>
+              <w:top w:type="dxa" w:w="60"/>
+              <w:left w:type="dxa" w:w="100"/>
+              <w:bottom w:type="dxa" w:w="60"/>
+              <w:right w:type="dxa" w:w="100"/>
+            </w:tcMar>
+          </w:tcPr>
+          <w:p>
+            <w:pPr>
+              <w:spacing w:after="20"/>
+            </w:pPr>
+            <w:r>
+              <w:rPr>
+                <w:rFonts w:ascii="Calibri" w:cs="Calibri" w:eastAsia="Calibri" w:hAnsi="Calibri"/>
+                <w:sz w:val="19"/>
+                <w:szCs w:val="19"/>
+              </w:rPr>
+              <w:t xml:space="preserve">M</w:t>
+            </w:r>
+          </w:p>
+        </w:tc>
+      </w:tr>
+      <w:tr>
+        <w:trPr>
+          <w:cantSplit/>
+        </w:trPr>
+        <w:tc>
+          <w:tcPr>
+            <w:tcW w:type="dxa" w:w="1100"/>
+            <w:tcBorders>
+              <w:top w:val="single" w:color="BFBFBF" w:sz="4"/>
+              <w:left w:val="single" w:color="BFBFBF" w:sz="4"/>
+              <w:bottom w:val="single" w:color="BFBFBF" w:sz="4"/>
+              <w:right w:val="single" w:color="BFBFBF" w:sz="4"/>
+            </w:tcBorders>
+            <w:shd w:fill="FAF7F0" w:color="auto" w:val="clear"/>
+            <w:tcMar>
+              <w:top w:type="dxa" w:w="60"/>
+              <w:left w:type="dxa" w:w="100"/>
+              <w:bottom w:type="dxa" w:w="60"/>
+              <w:right w:type="dxa" w:w="100"/>
+            </w:tcMar>
+          </w:tcPr>
+          <w:p>
+            <w:pPr>
+              <w:spacing w:after="20"/>
+            </w:pPr>
+            <w:r>
+              <w:rPr>
+                <w:rFonts w:ascii="Calibri" w:cs="Calibri" w:eastAsia="Calibri" w:hAnsi="Calibri"/>
+                <w:sz w:val="19"/>
+                <w:szCs w:val="19"/>
+              </w:rPr>
+              <w:t xml:space="preserve">FR-NV-01</w:t>
+            </w:r>
+          </w:p>
+        </w:tc>
+        <w:tc>
+          <w:tcPr>
+            <w:tcW w:type="dxa" w:w="1250"/>
+            <w:tcBorders>
+              <w:top w:val="single" w:color="BFBFBF" w:sz="4"/>
+              <w:left w:val="single" w:color="BFBFBF" w:sz="4"/>
+              <w:bottom w:val="single" w:color="BFBFBF" w:sz="4"/>
+              <w:right w:val="single" w:color="BFBFBF" w:sz="4"/>
+            </w:tcBorders>
+            <w:shd w:fill="FAF7F0" w:color="auto" w:val="clear"/>
+            <w:tcMar>
+              <w:top w:type="dxa" w:w="60"/>
+              <w:left w:type="dxa" w:w="100"/>
+              <w:bottom w:type="dxa" w:w="60"/>
+              <w:right w:type="dxa" w:w="100"/>
+            </w:tcMar>
+          </w:tcPr>
+          <w:p>
+            <w:pPr>
+              <w:spacing w:after="20"/>
+            </w:pPr>
+            <w:r>
+              <w:rPr>
+                <w:rFonts w:ascii="Calibri" w:cs="Calibri" w:eastAsia="Calibri" w:hAnsi="Calibri"/>
+                <w:sz w:val="19"/>
+                <w:szCs w:val="19"/>
+              </w:rPr>
+              <w:t xml:space="preserve">Navigation</w:t>
+            </w:r>
+          </w:p>
+        </w:tc>
+        <w:tc>
+          <w:tcPr>
+            <w:tcW w:type="dxa" w:w="6100"/>
+            <w:tcBorders>
+              <w:top w:val="single" w:color="BFBFBF" w:sz="4"/>
+              <w:left w:val="single" w:color="BFBFBF" w:sz="4"/>
+              <w:bottom w:val="single" w:color="BFBFBF" w:sz="4"/>
+              <w:right w:val="single" w:color="BFBFBF" w:sz="4"/>
+            </w:tcBorders>
+            <w:shd w:fill="FAF7F0" w:color="auto" w:val="clear"/>
+            <w:tcMar>
+              <w:top w:type="dxa" w:w="60"/>
+              <w:left w:type="dxa" w:w="100"/>
+              <w:bottom w:type="dxa" w:w="60"/>
+              <w:right w:type="dxa" w:w="100"/>
+            </w:tcMar>
+          </w:tcPr>
+          <w:p>
+            <w:pPr>
+              <w:spacing w:after="20"/>
+            </w:pPr>
+            <w:r>
+              <w:rPr>
+                <w:rFonts w:ascii="Calibri" w:cs="Calibri" w:eastAsia="Calibri" w:hAnsi="Calibri"/>
+                <w:sz w:val="19"/>
+                <w:szCs w:val="19"/>
+              </w:rPr>
+              <w:t xml:space="preserve">A Home button on every screen returns to the landing page.</w:t>
             </w:r>
           </w:p>
         </w:tc>
@@ -9353,7 +9607,7 @@
         <w:rPr>
           <w:rFonts w:ascii="Calibri" w:cs="Calibri" w:eastAsia="Calibri" w:hAnsi="Calibri"/>
         </w:rPr>
-        <w:t xml:space="preserve">As a farmer, I can drop a pin on my farm and see my three nearest markets with travel time, so that I choose where to sell. (FR-GI-02)</w:t>
+        <w:t xml:space="preserve">As a farmer, I can draw my farm boundary (or upload my surveyed shapefile) and see my nearest markets with travel time, so that I choose where to sell. (FR-ON-03, FR-GI-02)</w:t>
       </w:r>
     </w:p>
     <w:p>
@@ -10229,7 +10483,7 @@
         <w:rPr>
           <w:rFonts w:ascii="Calibri" w:cs="Calibri" w:eastAsia="Calibri" w:hAnsi="Calibri"/>
         </w:rPr>
-        <w:t xml:space="preserve">Farm pin by GPS or tap; the same pin drives weather, listings by distance and every insight card.</w:t>
+        <w:t xml:space="preserve">Farm boundary (drawn, or imported from a zipped shapefile) or a quick pin; its centre drives weather, listings by distance and every insight card. The outline is private to the farmer.</w:t>
       </w:r>
     </w:p>
     <w:p>

</xml_diff>